<commit_message>
no se logro terminar pero ahí va más de algo
</commit_message>
<xml_diff>
--- a/Documentación/EnsayoDocumentación.docx
+++ b/Documentación/EnsayoDocumentación.docx
@@ -5269,8 +5269,289 @@
       <w:pPr>
         <w:spacing w:line="276" w:lineRule="auto"/>
         <w:ind w:left="0" w:firstLine="0"/>
-        <w:rPr>
-          <w:rFonts w:ascii="Carlito"/>
+        <w:jc w:val="both"/>
+        <w:rPr>
+          <w:rFonts w:ascii="Times New Roman" w:eastAsia="Times New Roman" w:hAnsi="Times New Roman" w:cs="Times New Roman"/>
+          <w:b/>
+          <w:bCs/>
+          <w:sz w:val="24"/>
+          <w:szCs w:val="24"/>
+        </w:rPr>
+      </w:pPr>
+      <w:r>
+        <w:rPr>
+          <w:rFonts w:ascii="Times New Roman" w:eastAsia="Times New Roman" w:hAnsi="Times New Roman" w:cs="Times New Roman"/>
+          <w:b/>
+          <w:bCs/>
+          <w:sz w:val="24"/>
+          <w:szCs w:val="24"/>
+        </w:rPr>
+        <w:t>Diagrama de clases</w:t>
+      </w:r>
+    </w:p>
+    <w:p>
+      <w:pPr>
+        <w:rPr>
+          <w:rFonts w:ascii="Times New Roman" w:eastAsia="Times New Roman" w:hAnsi="Times New Roman" w:cs="Times New Roman"/>
+          <w:sz w:val="24"/>
+          <w:szCs w:val="24"/>
+        </w:rPr>
+      </w:pPr>
+      <w:r>
+        <w:rPr>
+          <w:noProof/>
+        </w:rPr>
+        <w:drawing>
+          <wp:anchor distT="0" distB="0" distL="114300" distR="114300" simplePos="0" relativeHeight="251660288" behindDoc="0" locked="0" layoutInCell="1" allowOverlap="1" wp14:anchorId="0FBADF88" wp14:editId="357C8264">
+            <wp:simplePos x="0" y="0"/>
+            <wp:positionH relativeFrom="margin">
+              <wp:posOffset>-178435</wp:posOffset>
+            </wp:positionH>
+            <wp:positionV relativeFrom="paragraph">
+              <wp:posOffset>337185</wp:posOffset>
+            </wp:positionV>
+            <wp:extent cx="7524750" cy="3045149"/>
+            <wp:effectExtent l="0" t="0" r="0" b="3175"/>
+            <wp:wrapNone/>
+            <wp:docPr id="2096585524" name="Imagen 3" descr="Diagrama&#10;&#10;Descripción generada automáticamente"/>
+            <wp:cNvGraphicFramePr>
+              <a:graphicFrameLocks xmlns:a="http://schemas.openxmlformats.org/drawingml/2006/main" noChangeAspect="1"/>
+            </wp:cNvGraphicFramePr>
+            <a:graphic xmlns:a="http://schemas.openxmlformats.org/drawingml/2006/main">
+              <a:graphicData uri="http://schemas.openxmlformats.org/drawingml/2006/picture">
+                <pic:pic xmlns:pic="http://schemas.openxmlformats.org/drawingml/2006/picture">
+                  <pic:nvPicPr>
+                    <pic:cNvPr id="2096585524" name="Imagen 3" descr="Diagrama&#10;&#10;Descripción generada automáticamente"/>
+                    <pic:cNvPicPr>
+                      <a:picLocks noChangeAspect="1" noChangeArrowheads="1"/>
+                    </pic:cNvPicPr>
+                  </pic:nvPicPr>
+                  <pic:blipFill>
+                    <a:blip r:embed="rId12" cstate="print">
+                      <a:extLst>
+                        <a:ext uri="{28A0092B-C50C-407E-A947-70E740481C1C}">
+                          <a14:useLocalDpi xmlns:a14="http://schemas.microsoft.com/office/drawing/2010/main" val="0"/>
+                        </a:ext>
+                      </a:extLst>
+                    </a:blip>
+                    <a:srcRect/>
+                    <a:stretch>
+                      <a:fillRect/>
+                    </a:stretch>
+                  </pic:blipFill>
+                  <pic:spPr bwMode="auto">
+                    <a:xfrm>
+                      <a:off x="0" y="0"/>
+                      <a:ext cx="7535960" cy="3049685"/>
+                    </a:xfrm>
+                    <a:prstGeom prst="rect">
+                      <a:avLst/>
+                    </a:prstGeom>
+                    <a:noFill/>
+                    <a:ln>
+                      <a:noFill/>
+                    </a:ln>
+                  </pic:spPr>
+                </pic:pic>
+              </a:graphicData>
+            </a:graphic>
+            <wp14:sizeRelH relativeFrom="margin">
+              <wp14:pctWidth>0</wp14:pctWidth>
+            </wp14:sizeRelH>
+            <wp14:sizeRelV relativeFrom="margin">
+              <wp14:pctHeight>0</wp14:pctHeight>
+            </wp14:sizeRelV>
+          </wp:anchor>
+        </w:drawing>
+      </w:r>
+      <w:r>
+        <w:rPr>
+          <w:rFonts w:ascii="Times New Roman" w:eastAsia="Times New Roman" w:hAnsi="Times New Roman" w:cs="Times New Roman"/>
+          <w:sz w:val="24"/>
+          <w:szCs w:val="24"/>
+        </w:rPr>
+        <w:br w:type="page"/>
+      </w:r>
+    </w:p>
+    <w:p>
+      <w:pPr>
+        <w:rPr>
+          <w:rFonts w:ascii="Times New Roman" w:eastAsia="Times New Roman" w:hAnsi="Times New Roman" w:cs="Times New Roman"/>
+          <w:sz w:val="24"/>
+          <w:szCs w:val="24"/>
+        </w:rPr>
+      </w:pPr>
+    </w:p>
+    <w:p>
+      <w:pPr>
+        <w:rPr>
+          <w:rFonts w:ascii="Times New Roman" w:eastAsia="Times New Roman" w:hAnsi="Times New Roman" w:cs="Times New Roman"/>
+          <w:sz w:val="24"/>
+          <w:szCs w:val="24"/>
+        </w:rPr>
+      </w:pPr>
+      <w:r>
+        <w:rPr>
+          <w:noProof/>
+        </w:rPr>
+        <w:drawing>
+          <wp:anchor distT="0" distB="0" distL="114300" distR="114300" simplePos="0" relativeHeight="251661312" behindDoc="0" locked="0" layoutInCell="1" allowOverlap="1" wp14:anchorId="263562CE" wp14:editId="096652A0">
+            <wp:simplePos x="0" y="0"/>
+            <wp:positionH relativeFrom="page">
+              <wp:align>right</wp:align>
+            </wp:positionH>
+            <wp:positionV relativeFrom="paragraph">
+              <wp:posOffset>177165</wp:posOffset>
+            </wp:positionV>
+            <wp:extent cx="7492355" cy="2400300"/>
+            <wp:effectExtent l="0" t="0" r="0" b="0"/>
+            <wp:wrapNone/>
+            <wp:docPr id="2630420" name="Imagen 4" descr="Diagrama, Word&#10;&#10;Descripción generada automáticamente"/>
+            <wp:cNvGraphicFramePr>
+              <a:graphicFrameLocks xmlns:a="http://schemas.openxmlformats.org/drawingml/2006/main" noChangeAspect="1"/>
+            </wp:cNvGraphicFramePr>
+            <a:graphic xmlns:a="http://schemas.openxmlformats.org/drawingml/2006/main">
+              <a:graphicData uri="http://schemas.openxmlformats.org/drawingml/2006/picture">
+                <pic:pic xmlns:pic="http://schemas.openxmlformats.org/drawingml/2006/picture">
+                  <pic:nvPicPr>
+                    <pic:cNvPr id="2630420" name="Imagen 4" descr="Diagrama, Word&#10;&#10;Descripción generada automáticamente"/>
+                    <pic:cNvPicPr>
+                      <a:picLocks noChangeAspect="1" noChangeArrowheads="1"/>
+                    </pic:cNvPicPr>
+                  </pic:nvPicPr>
+                  <pic:blipFill>
+                    <a:blip r:embed="rId13" cstate="print">
+                      <a:extLst>
+                        <a:ext uri="{28A0092B-C50C-407E-A947-70E740481C1C}">
+                          <a14:useLocalDpi xmlns:a14="http://schemas.microsoft.com/office/drawing/2010/main" val="0"/>
+                        </a:ext>
+                      </a:extLst>
+                    </a:blip>
+                    <a:srcRect/>
+                    <a:stretch>
+                      <a:fillRect/>
+                    </a:stretch>
+                  </pic:blipFill>
+                  <pic:spPr bwMode="auto">
+                    <a:xfrm>
+                      <a:off x="0" y="0"/>
+                      <a:ext cx="7492355" cy="2400300"/>
+                    </a:xfrm>
+                    <a:prstGeom prst="rect">
+                      <a:avLst/>
+                    </a:prstGeom>
+                    <a:noFill/>
+                    <a:ln>
+                      <a:noFill/>
+                    </a:ln>
+                  </pic:spPr>
+                </pic:pic>
+              </a:graphicData>
+            </a:graphic>
+            <wp14:sizeRelH relativeFrom="margin">
+              <wp14:pctWidth>0</wp14:pctWidth>
+            </wp14:sizeRelH>
+            <wp14:sizeRelV relativeFrom="margin">
+              <wp14:pctHeight>0</wp14:pctHeight>
+            </wp14:sizeRelV>
+          </wp:anchor>
+        </w:drawing>
+      </w:r>
+      <w:r>
+        <w:rPr>
+          <w:rFonts w:ascii="Times New Roman" w:eastAsia="Times New Roman" w:hAnsi="Times New Roman" w:cs="Times New Roman"/>
+          <w:sz w:val="24"/>
+          <w:szCs w:val="24"/>
+        </w:rPr>
+        <w:t xml:space="preserve">Diagrama de </w:t>
+      </w:r>
+      <w:r>
+        <w:rPr>
+          <w:rFonts w:ascii="Times New Roman" w:eastAsia="Times New Roman" w:hAnsi="Times New Roman" w:cs="Times New Roman"/>
+          <w:sz w:val="24"/>
+          <w:szCs w:val="24"/>
+        </w:rPr>
+        <w:t>Actividades</w:t>
+      </w:r>
+    </w:p>
+    <w:p>
+      <w:pPr>
+        <w:rPr>
+          <w:rFonts w:ascii="Times New Roman" w:eastAsia="Times New Roman" w:hAnsi="Times New Roman" w:cs="Times New Roman"/>
+          <w:sz w:val="24"/>
+          <w:szCs w:val="24"/>
+        </w:rPr>
+      </w:pPr>
+    </w:p>
+    <w:p>
+      <w:pPr>
+        <w:rPr>
+          <w:rFonts w:ascii="Times New Roman" w:eastAsia="Times New Roman" w:hAnsi="Times New Roman" w:cs="Times New Roman"/>
+          <w:sz w:val="24"/>
+          <w:szCs w:val="24"/>
+        </w:rPr>
+      </w:pPr>
+    </w:p>
+    <w:p>
+      <w:pPr>
+        <w:rPr>
+          <w:rFonts w:ascii="Times New Roman" w:eastAsia="Times New Roman" w:hAnsi="Times New Roman" w:cs="Times New Roman"/>
+          <w:sz w:val="24"/>
+          <w:szCs w:val="24"/>
+        </w:rPr>
+      </w:pPr>
+    </w:p>
+    <w:p>
+      <w:pPr>
+        <w:rPr>
+          <w:rFonts w:ascii="Times New Roman" w:eastAsia="Times New Roman" w:hAnsi="Times New Roman" w:cs="Times New Roman"/>
+          <w:sz w:val="24"/>
+          <w:szCs w:val="24"/>
+        </w:rPr>
+      </w:pPr>
+    </w:p>
+    <w:p>
+      <w:pPr>
+        <w:rPr>
+          <w:rFonts w:ascii="Times New Roman" w:eastAsia="Times New Roman" w:hAnsi="Times New Roman" w:cs="Times New Roman"/>
+          <w:sz w:val="24"/>
+          <w:szCs w:val="24"/>
+        </w:rPr>
+      </w:pPr>
+    </w:p>
+    <w:p>
+      <w:pPr>
+        <w:rPr>
+          <w:rFonts w:ascii="Times New Roman" w:eastAsia="Times New Roman" w:hAnsi="Times New Roman" w:cs="Times New Roman"/>
+          <w:sz w:val="24"/>
+          <w:szCs w:val="24"/>
+        </w:rPr>
+      </w:pPr>
+    </w:p>
+    <w:p>
+      <w:pPr>
+        <w:rPr>
+          <w:rFonts w:ascii="Times New Roman" w:eastAsia="Times New Roman" w:hAnsi="Times New Roman" w:cs="Times New Roman"/>
+          <w:sz w:val="24"/>
+          <w:szCs w:val="24"/>
+        </w:rPr>
+      </w:pPr>
+    </w:p>
+    <w:p>
+      <w:pPr>
+        <w:rPr>
+          <w:rFonts w:ascii="Times New Roman" w:eastAsia="Times New Roman" w:hAnsi="Times New Roman" w:cs="Times New Roman"/>
+          <w:sz w:val="24"/>
+          <w:szCs w:val="24"/>
+        </w:rPr>
+      </w:pPr>
+    </w:p>
+    <w:p>
+      <w:pPr>
+        <w:rPr>
+          <w:rFonts w:ascii="Times New Roman" w:eastAsia="Times New Roman" w:hAnsi="Times New Roman" w:cs="Times New Roman"/>
+          <w:sz w:val="24"/>
+          <w:szCs w:val="24"/>
         </w:rPr>
       </w:pPr>
     </w:p>
@@ -5278,6 +5559,63 @@
       <w:pPr>
         <w:spacing w:line="276" w:lineRule="auto"/>
         <w:ind w:left="0" w:firstLine="0"/>
+        <w:jc w:val="both"/>
+        <w:rPr>
+          <w:rFonts w:ascii="Times New Roman" w:eastAsia="Times New Roman" w:hAnsi="Times New Roman" w:cs="Times New Roman"/>
+          <w:sz w:val="24"/>
+          <w:szCs w:val="24"/>
+        </w:rPr>
+      </w:pPr>
+    </w:p>
+    <w:p>
+      <w:pPr>
+        <w:spacing w:line="276" w:lineRule="auto"/>
+        <w:ind w:left="0" w:firstLine="0"/>
+        <w:jc w:val="both"/>
+        <w:rPr>
+          <w:rFonts w:ascii="Times New Roman" w:eastAsia="Times New Roman" w:hAnsi="Times New Roman" w:cs="Times New Roman"/>
+          <w:sz w:val="24"/>
+          <w:szCs w:val="24"/>
+        </w:rPr>
+      </w:pPr>
+    </w:p>
+    <w:p>
+      <w:pPr>
+        <w:spacing w:line="276" w:lineRule="auto"/>
+        <w:ind w:left="0" w:firstLine="0"/>
+        <w:jc w:val="both"/>
+        <w:rPr>
+          <w:rFonts w:ascii="Times New Roman" w:eastAsia="Times New Roman" w:hAnsi="Times New Roman" w:cs="Times New Roman"/>
+          <w:sz w:val="24"/>
+          <w:szCs w:val="24"/>
+        </w:rPr>
+      </w:pPr>
+    </w:p>
+    <w:p>
+      <w:pPr>
+        <w:spacing w:line="276" w:lineRule="auto"/>
+        <w:ind w:left="0" w:firstLine="0"/>
+        <w:jc w:val="both"/>
+        <w:rPr>
+          <w:rFonts w:ascii="Times New Roman" w:eastAsia="Times New Roman" w:hAnsi="Times New Roman" w:cs="Times New Roman"/>
+          <w:sz w:val="24"/>
+          <w:szCs w:val="24"/>
+        </w:rPr>
+      </w:pPr>
+    </w:p>
+    <w:p>
+      <w:pPr>
+        <w:spacing w:line="276" w:lineRule="auto"/>
+        <w:ind w:left="0" w:firstLine="0"/>
+        <w:rPr>
+          <w:rFonts w:ascii="Carlito"/>
+        </w:rPr>
+      </w:pPr>
+    </w:p>
+    <w:p>
+      <w:pPr>
+        <w:spacing w:line="276" w:lineRule="auto"/>
+        <w:ind w:left="0" w:firstLine="0"/>
       </w:pPr>
       <w:r>
         <w:rPr>
@@ -5295,141 +5633,51 @@
           <w:rFonts w:ascii="Times New Roman" w:eastAsia="Times New Roman" w:hAnsi="Times New Roman" w:cs="Times New Roman"/>
           <w:sz w:val="24"/>
           <w:szCs w:val="24"/>
-        </w:rPr>
-      </w:pPr>
-      <w:r>
-        <w:rPr>
-          <w:rFonts w:ascii="Times New Roman" w:eastAsia="Times New Roman" w:hAnsi="Times New Roman" w:cs="Times New Roman"/>
-          <w:sz w:val="24"/>
-          <w:szCs w:val="24"/>
-        </w:rPr>
-        <w:t>Máximo 5 referencias</w:t>
-      </w:r>
-      <w:r>
-        <w:rPr>
-          <w:rFonts w:ascii="Times New Roman" w:eastAsia="Times New Roman" w:hAnsi="Times New Roman" w:cs="Times New Roman"/>
-          <w:sz w:val="24"/>
-          <w:szCs w:val="24"/>
-        </w:rPr>
-        <w:t xml:space="preserve"> en orden alfabético</w:t>
-      </w:r>
-      <w:r>
-        <w:rPr>
-          <w:rFonts w:ascii="Times New Roman" w:eastAsia="Times New Roman" w:hAnsi="Times New Roman" w:cs="Times New Roman"/>
-          <w:sz w:val="24"/>
-          <w:szCs w:val="24"/>
-        </w:rPr>
-        <w:t>.</w:t>
-      </w:r>
+          <w:u w:val="single"/>
+        </w:rPr>
+      </w:pPr>
     </w:p>
     <w:p>
       <w:pPr>
         <w:spacing w:line="276" w:lineRule="auto"/>
         <w:ind w:left="0" w:firstLine="0"/>
       </w:pPr>
+      <w:hyperlink r:id="rId14" w:history="1">
+        <w:r>
+          <w:rPr>
+            <w:rStyle w:val="Hipervnculo"/>
+          </w:rPr>
+          <w:t>https://www.python.org/doc/</w:t>
+        </w:r>
+      </w:hyperlink>
     </w:p>
     <w:p>
       <w:pPr>
         <w:spacing w:line="276" w:lineRule="auto"/>
         <w:ind w:left="0" w:firstLine="0"/>
-        <w:jc w:val="both"/>
-        <w:rPr>
-          <w:lang w:val="en-US"/>
-        </w:rPr>
-      </w:pPr>
-      <w:r>
-        <w:rPr>
-          <w:rFonts w:ascii="Times New Roman" w:eastAsia="Times New Roman" w:hAnsi="Times New Roman" w:cs="Times New Roman"/>
-          <w:sz w:val="24"/>
-          <w:szCs w:val="24"/>
-          <w:lang w:val="en-US"/>
-        </w:rPr>
-        <w:t>C. J. Date</w:t>
-      </w:r>
-      <w:r>
-        <w:rPr>
-          <w:rFonts w:ascii="Times New Roman" w:eastAsia="Times New Roman" w:hAnsi="Times New Roman" w:cs="Times New Roman"/>
-          <w:sz w:val="24"/>
-          <w:szCs w:val="24"/>
-          <w:lang w:val="en-US"/>
-        </w:rPr>
-        <w:t>, (199</w:t>
-      </w:r>
-      <w:r>
-        <w:rPr>
-          <w:rFonts w:ascii="Times New Roman" w:eastAsia="Times New Roman" w:hAnsi="Times New Roman" w:cs="Times New Roman"/>
-          <w:sz w:val="24"/>
-          <w:szCs w:val="24"/>
-          <w:lang w:val="en-US"/>
-        </w:rPr>
-        <w:t>1</w:t>
-      </w:r>
-      <w:r>
-        <w:rPr>
-          <w:rFonts w:ascii="Times New Roman" w:eastAsia="Times New Roman" w:hAnsi="Times New Roman" w:cs="Times New Roman"/>
-          <w:sz w:val="24"/>
-          <w:szCs w:val="24"/>
-          <w:lang w:val="en-US"/>
-        </w:rPr>
-        <w:t>).</w:t>
-      </w:r>
-      <w:r>
-        <w:rPr>
-          <w:rFonts w:ascii="Times New Roman" w:eastAsia="Times New Roman" w:hAnsi="Times New Roman" w:cs="Times New Roman"/>
-          <w:i/>
-          <w:sz w:val="24"/>
-          <w:szCs w:val="24"/>
-          <w:lang w:val="en-US"/>
-        </w:rPr>
-        <w:t xml:space="preserve"> </w:t>
-      </w:r>
-      <w:r>
-        <w:rPr>
-          <w:rFonts w:ascii="Times New Roman" w:eastAsia="Times New Roman" w:hAnsi="Times New Roman" w:cs="Times New Roman"/>
-          <w:i/>
-          <w:sz w:val="24"/>
-          <w:szCs w:val="24"/>
-          <w:lang w:val="en-US"/>
-        </w:rPr>
-        <w:t>An introduction to Database Systems</w:t>
-      </w:r>
-      <w:r>
-        <w:rPr>
-          <w:rFonts w:ascii="Times New Roman" w:eastAsia="Times New Roman" w:hAnsi="Times New Roman" w:cs="Times New Roman"/>
-          <w:i/>
-          <w:sz w:val="24"/>
-          <w:szCs w:val="24"/>
-          <w:lang w:val="en-US"/>
-        </w:rPr>
-        <w:t>.</w:t>
-      </w:r>
-      <w:r>
-        <w:rPr>
-          <w:rFonts w:ascii="Times New Roman" w:eastAsia="Times New Roman" w:hAnsi="Times New Roman" w:cs="Times New Roman"/>
-          <w:sz w:val="24"/>
-          <w:szCs w:val="24"/>
-          <w:lang w:val="en-US"/>
-        </w:rPr>
-        <w:t xml:space="preserve"> </w:t>
-      </w:r>
-      <w:r>
-        <w:rPr>
-          <w:rFonts w:ascii="Times New Roman" w:eastAsia="Times New Roman" w:hAnsi="Times New Roman" w:cs="Times New Roman"/>
-          <w:sz w:val="24"/>
-          <w:szCs w:val="24"/>
-          <w:lang w:val="en-US"/>
-        </w:rPr>
-        <w:t>Addison-Wesley Publishing Company, Inc</w:t>
-      </w:r>
-      <w:r>
-        <w:rPr>
-          <w:rFonts w:ascii="Times New Roman" w:eastAsia="Times New Roman" w:hAnsi="Times New Roman" w:cs="Times New Roman"/>
-          <w:sz w:val="24"/>
-          <w:szCs w:val="24"/>
-          <w:lang w:val="en-US"/>
-        </w:rPr>
-        <w:t xml:space="preserve">. </w:t>
-      </w:r>
+      </w:pPr>
+      <w:hyperlink r:id="rId15" w:history="1">
+        <w:r>
+          <w:rPr>
+            <w:rStyle w:val="Hipervnculo"/>
+          </w:rPr>
+          <w:t>https://docs.djangoproject.com/en/5.1/</w:t>
+        </w:r>
+      </w:hyperlink>
+    </w:p>
+    <w:p>
+      <w:pPr>
+        <w:spacing w:line="276" w:lineRule="auto"/>
+        <w:ind w:left="0" w:firstLine="0"/>
+      </w:pPr>
+      <w:hyperlink r:id="rId16" w:history="1">
+        <w:r>
+          <w:rPr>
+            <w:rStyle w:val="Hipervnculo"/>
+          </w:rPr>
+          <w:t>https://flask.palletsprojects.com/en/stable/</w:t>
+        </w:r>
+      </w:hyperlink>
     </w:p>
     <w:p>
       <w:pPr>
@@ -8159,6 +8407,7 @@
   <w:style w:type="character" w:default="1" w:styleId="Fuentedeprrafopredeter">
     <w:name w:val="Default Paragraph Font"/>
     <w:uiPriority w:val="1"/>
+    <w:semiHidden/>
     <w:unhideWhenUsed/>
   </w:style>
   <w:style w:type="table" w:default="1" w:styleId="Tablanormal">
@@ -8307,6 +8556,29 @@
       <w:ind w:left="720"/>
       <w:contextualSpacing/>
     </w:pPr>
+  </w:style>
+  <w:style w:type="character" w:styleId="Hipervnculo">
+    <w:name w:val="Hyperlink"/>
+    <w:basedOn w:val="Fuentedeprrafopredeter"/>
+    <w:uiPriority w:val="99"/>
+    <w:unhideWhenUsed/>
+    <w:rsid w:val="00180F97"/>
+    <w:rPr>
+      <w:color w:val="0563C1" w:themeColor="hyperlink"/>
+      <w:u w:val="single"/>
+    </w:rPr>
+  </w:style>
+  <w:style w:type="character" w:styleId="Mencinsinresolver">
+    <w:name w:val="Unresolved Mention"/>
+    <w:basedOn w:val="Fuentedeprrafopredeter"/>
+    <w:uiPriority w:val="99"/>
+    <w:semiHidden/>
+    <w:unhideWhenUsed/>
+    <w:rsid w:val="00180F97"/>
+    <w:rPr>
+      <w:color w:val="605E5C"/>
+      <w:shd w:val="clear" w:color="auto" w:fill="E1DFDD"/>
+    </w:rPr>
   </w:style>
 </w:styles>
 </file>

</xml_diff>